<commit_message>
Maitê Proença: revisão da parte 5
Co-Authored-By: Claude Opus 5.5 <noreply@anthropic.com>
Claude-Session: https://claude.ai/code/session_01MJjUEEZrxQDEUifKK2vj9g
</commit_message>
<xml_diff>
--- a/roteiros/maite-proenca/MaiteProenca_Parte5.docx
+++ b/roteiros/maite-proenca/MaiteProenca_Parte5.docx
@@ -39,7 +39,7 @@
         <w:rPr>
           <w:color w:val="000000"/>
         </w:rPr>
-        <w:t>Mas, no meio do quadro, a história que Maitê tinha guardado a vida inteira foi contada ao vivo, para milhões de pessoas. A mãe dela tinha sido morta pelo próprio pai, quando ela tinha doze anos.</w:t>
+        <w:t>Mas, no meio do quadro, a história que Maitê tinha guardado a vida inteira foi contada no ar, para milhões de pessoas. A mãe dela tinha sido morta pelo próprio pai, quando ela tinha doze anos.</w:t>
       </w:r>
     </w:p>
     <w:p>
@@ -303,7 +303,7 @@
         <w:rPr>
           <w:color w:val="000000"/>
         </w:rPr>
-        <w:t>Em agosto de dois mil e vinte e quatro, numa entrevista ao programa "The Business of Life", Maitê olhou para trás e disse uma frase assustadora.</w:t>
+        <w:t>Em agosto de dois mil e vinte e quatro, numa entrevista ao programa "The Business of Life", Maitê olhou para trás e disse uma frase que ela mesma levou décadas para entender.</w:t>
       </w:r>
     </w:p>
     <w:p>
@@ -367,7 +367,7 @@
         <w:rPr>
           <w:color w:val="000000"/>
         </w:rPr>
-        <w:t>Terminou com uma imagem que resume cinquenta anos de luta: "Fui tentando, falando, buscando, conversando… até que me livrei. Essa mala pesada, eu não carrego mais."</w:t>
+        <w:t>Terminou com uma imagem que resume mais de cinquenta anos de luta: "Fui tentando, falando, buscando, conversando… até que me livrei. Essa mala pesada, eu não carrego mais."</w:t>
       </w:r>
     </w:p>
     <w:p>
@@ -447,7 +447,7 @@
         <w:rPr>
           <w:color w:val="000000"/>
         </w:rPr>
-        <w:t>Maitê levou cinquenta anos para fazer isso. E, agora, recebe as netas num lugar onde as portas ficam abertas.</w:t>
+        <w:t>Maitê levou décadas para fazer isso. E, agora, recebe as netas num lugar onde as portas ficam abertas.</w:t>
       </w:r>
     </w:p>
     <w:p>

</xml_diff>

<commit_message>
Maitê Proença: ajustes finais na parte 5
Co-Authored-By: Claude Opus 5.5 <noreply@anthropic.com>
Claude-Session: https://claude.ai/code/session_01MJjUEEZrxQDEUifKK2vj9g
</commit_message>
<xml_diff>
--- a/roteiros/maite-proenca/MaiteProenca_Parte5.docx
+++ b/roteiros/maite-proenca/MaiteProenca_Parte5.docx
@@ -23,7 +23,7 @@
         <w:rPr>
           <w:color w:val="000000"/>
         </w:rPr>
-        <w:t>Maitê Proença era convidada do "Domingão do Faustão", o programa de maior audiência dos domingos na televisão brasileira.</w:t>
+        <w:t>Maitê Proença era convidada do "Domingão do Faustão", um dos programas de maior audiência da televisão brasileira.</w:t>
       </w:r>
     </w:p>
     <w:p>
@@ -415,7 +415,7 @@
         <w:rPr>
           <w:color w:val="000000"/>
         </w:rPr>
-        <w:t>O revólver de agosto de mil novecentos e setenta, que devia ter servido de alarme. A porta trancada daquele quarto. A carta rasgada que ninguém nunca viu. O depoimento de uma menina de doze anos que ajudou a absolver o pai. E a capa de revista que mostrava ao Brasil uma mulher livre, enquanto por trás dela havia uma mãe morta e um pai livre.</w:t>
+        <w:t>O revólver de agosto de mil novecentos e setenta, que devia ter servido de alarme. A porta trancada daquele quarto. A carta rasgada que ninguém nunca viu. O depoimento de uma menina de doze anos que ajudou a absolver o pai. E a capa de revista que mostrava ao Brasil uma mulher livre, enquanto por trás dela havia uma mãe morta e um pai perdoado pela Justiça.</w:t>
       </w:r>
     </w:p>
     <w:p>

</xml_diff>